<commit_message>
Macro troubleshooting lives in the User Manual; installation manual renamed
All Excel/macro issues (blocked macros, the untrusted-source banner,
the old-workbook compile error) move from the installation manual to
the User Manual's Troubleshooting section, where analysts hit them —
the installation manual keeps only the four install/launch items and a
one-line pointer to the User Manual for anything Excel-side. The
installation manual is also renamed to 2026.09.17 (Jane's rename).

Co-Authored-By: Claude Fable 5 <noreply@anthropic.com>
</commit_message>
<xml_diff>
--- a/TR-Analyzer User Manual.docx
+++ b/TR-Analyzer User Manual.docx
@@ -2361,6 +2361,66 @@
           <w:bCs/>
         </w:rPr>
         <w:t xml:space="preserve">Troubleshooting</w:t>
+      </w:r>
+    </w:p>
+    <w:p>
+      <w:pPr>
+        <w:spacing w:after="40"/>
+      </w:pPr>
+      <w:r>
+        <w:rPr>
+          <w:b/>
+          <w:bCs/>
+        </w:rPr>
+        <w:t xml:space="preserve">Excel says “Because of your security settings, macros have been disabled.”</w:t>
+      </w:r>
+    </w:p>
+    <w:p>
+      <w:pPr>
+        <w:spacing w:after="200"/>
+      </w:pPr>
+      <w:r>
+        <w:t xml:space="preserve">The workbook still carries Windows’ downloaded-file flag, or you changed the macro settings while the file was open. Close the workbook, right-click TR-Analyzer.xlsm (or, better, the ZIP before extracting) → Properties → tick Unblock → OK, then reopen it and click Enable Content. Trust Center changes only take effect after the file is reopened.</w:t>
+      </w:r>
+    </w:p>
+    <w:p>
+      <w:pPr>
+        <w:spacing w:after="40"/>
+      </w:pPr>
+      <w:r>
+        <w:rPr>
+          <w:b/>
+          <w:bCs/>
+        </w:rPr>
+        <w:t xml:space="preserve">A red banner says “Microsoft has blocked macros because the source of this file is untrusted.”</w:t>
+      </w:r>
+    </w:p>
+    <w:p>
+      <w:pPr>
+        <w:spacing w:after="200"/>
+      </w:pPr>
+      <w:r>
+        <w:t xml:space="preserve">Same cause, same fix: Unblock the file (or the ZIP) and reopen. If Properties shows no Unblock box or the banner keeps coming back, your organization’s IT policy is blocking internet-sourced macros — add the extracted folder under File → Options → Trust Center → Trusted Locations, or ask IT to whitelist the folder.</w:t>
+      </w:r>
+    </w:p>
+    <w:p>
+      <w:pPr>
+        <w:spacing w:after="40"/>
+      </w:pPr>
+      <w:r>
+        <w:rPr>
+          <w:b/>
+          <w:bCs/>
+        </w:rPr>
+        <w:t xml:space="preserve">Running the macro stops with “Compile error: Sub or Function not defined.”</w:t>
+      </w:r>
+    </w:p>
+    <w:p>
+      <w:pPr>
+        <w:spacing w:after="200"/>
+      </w:pPr>
+      <w:r>
+        <w:t xml:space="preserve">Your analyzer workbook is from an older download. Download the latest ZIP from the vba branch and use the vba/TR-Analyzer.xlsm inside it.</w:t>
       </w:r>
     </w:p>
     <w:p>

</xml_diff>

<commit_message>
User Manual: one troubleshooting table, ten rows
The manual had two troubleshooting sections — its original Section 7
symptom table (which the appended section from last week overlooked)
and the appended list after the quick reference. Merged: the four
non-duplicate appended items (old-workbook compile error, old-
generation input refused, analyzer saved over with data, pivot totals
vs deal count) join the Section 7 table as rows, the unblock row gains
the Trusted-Locations / reopen-to-apply detail, and the duplicate
appended section is removed. Ten rows, one place to look.

Co-Authored-By: Claude Fable 5 <noreply@anthropic.com>
</commit_message>
<xml_diff>
--- a/TR-Analyzer User Manual.docx
+++ b/TR-Analyzer User Manual.docx
@@ -1903,7 +1903,7 @@
                 <w:sz w:val="20"/>
                 <w:szCs w:val="20"/>
               </w:rPr>
-              <w:t>The ZIP was extracted without unblocking (Windows). Delete the folder, right-click the ZIP → Properties → Unblock → OK, extract again.</w:t>
+              <w:t>The ZIP was extracted without unblocking (Windows). Delete the folder, right-click the ZIP → Properties → Unblock → OK, extract again. If the message keeps coming back (or Properties has no Unblock box), IT policy is blocking internet macros — add the folder under File → Options → Trust Center → Trusted Locations, or ask IT. Note: macro-setting changes only take effect after the workbook is reopened.</w:t>
             </w:r>
           </w:p>
         </w:tc>
@@ -2145,6 +2145,198 @@
                 <w:szCs w:val="20"/>
               </w:rPr>
               <w:t xml:space="preserve">That's normal for optional fields the GP doesn't report — they stay blank. Only fix mappings for data that is actually in the file.</w:t>
+            </w:r>
+          </w:p>
+        </w:tc>
+      </w:tr>
+      <w:tr>
+        <w:tblPrEx>
+          <w:tblCellMar>
+            <w:top w:w="0" w:type="dxa"/>
+            <w:bottom w:w="0" w:type="dxa"/>
+          </w:tblCellMar>
+        </w:tblPrEx>
+        <w:tc>
+          <w:tcPr>
+            <w:tcW w:w="3300" w:type="dxa"/>
+            <w:tcMar>
+              <w:top w:w="90" w:type="dxa"/>
+              <w:left w:w="110" w:type="dxa"/>
+              <w:bottom w:w="90" w:type="dxa"/>
+              <w:right w:w="110" w:type="dxa"/>
+            </w:tcMar>
+          </w:tcPr>
+          <w:p>
+            <w:r>
+              <w:rPr>
+                <w:sz w:val="20"/>
+                <w:szCs w:val="20"/>
+              </w:rPr>
+              <w:t xml:space="preserve">“Compile error: Sub or Function not defined”</w:t>
+            </w:r>
+          </w:p>
+        </w:tc>
+        <w:tc>
+          <w:tcPr>
+            <w:tcW w:w="6060" w:type="dxa"/>
+            <w:tcMar>
+              <w:top w:w="90" w:type="dxa"/>
+              <w:left w:w="110" w:type="dxa"/>
+              <w:bottom w:w="90" w:type="dxa"/>
+              <w:right w:w="110" w:type="dxa"/>
+            </w:tcMar>
+          </w:tcPr>
+          <w:p>
+            <w:r>
+              <w:rPr>
+                <w:sz w:val="20"/>
+                <w:szCs w:val="20"/>
+              </w:rPr>
+              <w:t xml:space="preserve">The analyzer workbook is from an older download. Get the latest ZIP from the vba branch and use its vba/TR-Analyzer.xlsm.</w:t>
+            </w:r>
+          </w:p>
+        </w:tc>
+      </w:tr>
+      <w:tr>
+        <w:tblPrEx>
+          <w:tblCellMar>
+            <w:top w:w="0" w:type="dxa"/>
+            <w:bottom w:w="0" w:type="dxa"/>
+          </w:tblCellMar>
+        </w:tblPrEx>
+        <w:tc>
+          <w:tcPr>
+            <w:tcW w:w="3300" w:type="dxa"/>
+            <w:tcMar>
+              <w:top w:w="90" w:type="dxa"/>
+              <w:left w:w="110" w:type="dxa"/>
+              <w:bottom w:w="90" w:type="dxa"/>
+              <w:right w:w="110" w:type="dxa"/>
+            </w:tcMar>
+          </w:tcPr>
+          <w:p>
+            <w:r>
+              <w:rPr>
+                <w:sz w:val="20"/>
+                <w:szCs w:val="20"/>
+              </w:rPr>
+              <w:t xml:space="preserve">“…was generated by an OLDER version of the app” message</w:t>
+            </w:r>
+          </w:p>
+        </w:tc>
+        <w:tc>
+          <w:tcPr>
+            <w:tcW w:w="6060" w:type="dxa"/>
+            <w:tcMar>
+              <w:top w:w="90" w:type="dxa"/>
+              <w:left w:w="110" w:type="dxa"/>
+              <w:bottom w:w="90" w:type="dxa"/>
+              <w:right w:w="110" w:type="dxa"/>
+            </w:tcMar>
+          </w:tcPr>
+          <w:p>
+            <w:r>
+              <w:rPr>
+                <w:sz w:val="20"/>
+                <w:szCs w:val="20"/>
+              </w:rPr>
+              <w:t xml:space="preserve">The program and the input file must come from the same version. Re-download the program, run the GP’s file through the app again, and pick the freshly downloaded input file.</w:t>
+            </w:r>
+          </w:p>
+        </w:tc>
+      </w:tr>
+      <w:tr>
+        <w:tblPrEx>
+          <w:tblCellMar>
+            <w:top w:w="0" w:type="dxa"/>
+            <w:bottom w:w="0" w:type="dxa"/>
+          </w:tblCellMar>
+        </w:tblPrEx>
+        <w:tc>
+          <w:tcPr>
+            <w:tcW w:w="3300" w:type="dxa"/>
+            <w:tcMar>
+              <w:top w:w="90" w:type="dxa"/>
+              <w:left w:w="110" w:type="dxa"/>
+              <w:bottom w:w="90" w:type="dxa"/>
+              <w:right w:w="110" w:type="dxa"/>
+            </w:tcMar>
+          </w:tcPr>
+          <w:p>
+            <w:r>
+              <w:rPr>
+                <w:sz w:val="20"/>
+                <w:szCs w:val="20"/>
+              </w:rPr>
+              <w:t xml:space="preserve">TR-Analyzer.xlsm opens already full of a previous GP’s tabs</w:t>
+            </w:r>
+          </w:p>
+        </w:tc>
+        <w:tc>
+          <w:tcPr>
+            <w:tcW w:w="6060" w:type="dxa"/>
+            <w:tcMar>
+              <w:top w:w="90" w:type="dxa"/>
+              <w:left w:w="110" w:type="dxa"/>
+              <w:bottom w:w="90" w:type="dxa"/>
+              <w:right w:w="110" w:type="dxa"/>
+            </w:tcMar>
+          </w:tcPr>
+          <w:p>
+            <w:r>
+              <w:rPr>
+                <w:sz w:val="20"/>
+                <w:szCs w:val="20"/>
+              </w:rPr>
+              <w:t xml:space="preserve">A finished analysis was saved over the analyzer. Delete that copy and take a fresh vba/TR-Analyzer.xlsm; always Save As a build under its own name.</w:t>
+            </w:r>
+          </w:p>
+        </w:tc>
+      </w:tr>
+      <w:tr>
+        <w:tblPrEx>
+          <w:tblCellMar>
+            <w:top w:w="0" w:type="dxa"/>
+            <w:bottom w:w="0" w:type="dxa"/>
+          </w:tblCellMar>
+        </w:tblPrEx>
+        <w:tc>
+          <w:tcPr>
+            <w:tcW w:w="3300" w:type="dxa"/>
+            <w:tcMar>
+              <w:top w:w="90" w:type="dxa"/>
+              <w:left w:w="110" w:type="dxa"/>
+              <w:bottom w:w="90" w:type="dxa"/>
+              <w:right w:w="110" w:type="dxa"/>
+            </w:tcMar>
+          </w:tcPr>
+          <w:p>
+            <w:r>
+              <w:rPr>
+                <w:sz w:val="20"/>
+                <w:szCs w:val="20"/>
+              </w:rPr>
+              <w:t xml:space="preserve">A pivot’s total doesn’t match the number of deals</w:t>
+            </w:r>
+          </w:p>
+        </w:tc>
+        <w:tc>
+          <w:tcPr>
+            <w:tcW w:w="6060" w:type="dxa"/>
+            <w:tcMar>
+              <w:top w:w="90" w:type="dxa"/>
+              <w:left w:w="110" w:type="dxa"/>
+              <w:bottom w:w="90" w:type="dxa"/>
+              <w:right w:w="110" w:type="dxa"/>
+            </w:tcMar>
+          </w:tcPr>
+          <w:p>
+            <w:r>
+              <w:rPr>
+                <w:sz w:val="20"/>
+                <w:szCs w:val="20"/>
+              </w:rPr>
+              <w:t xml:space="preserve">Deals missing that pivot’s label (e.g. no sector) are hidden from it and its totals — nothing is deleted. Un-hide via the pivot’s filter dropdown.</w:t>
             </w:r>
           </w:p>
         </w:tc>
@@ -2338,163 +2530,6 @@
         </w:tc>
       </w:tr>
     </w:tbl>
-    <w:p>
-      <w:pPr>
-        <w:pStyle w:val="Heading1"/>
-        <w:spacing w:after="120"/>
-        <w:rPr>
-          <w:b/>
-          <w:bCs/>
-        </w:rPr>
-      </w:pPr>
-      <w:r>
-        <w:rPr>
-          <w:b/>
-          <w:bCs/>
-        </w:rPr>
-        <w:t xml:space="preserve">Troubleshooting</w:t>
-      </w:r>
-    </w:p>
-    <w:p>
-      <w:pPr>
-        <w:spacing w:after="40"/>
-      </w:pPr>
-      <w:r>
-        <w:rPr>
-          <w:b/>
-          <w:bCs/>
-        </w:rPr>
-        <w:t xml:space="preserve">Excel says “Because of your security settings, macros have been disabled.”</w:t>
-      </w:r>
-    </w:p>
-    <w:p>
-      <w:pPr>
-        <w:spacing w:after="200"/>
-      </w:pPr>
-      <w:r>
-        <w:t xml:space="preserve">The workbook still carries Windows’ downloaded-file flag, or you changed the macro settings while the file was open. Close the workbook, right-click TR-Analyzer.xlsm (or, better, the ZIP before extracting) → Properties → tick Unblock → OK, then reopen it and click Enable Content. Trust Center changes only take effect after the file is reopened.</w:t>
-      </w:r>
-    </w:p>
-    <w:p>
-      <w:pPr>
-        <w:spacing w:after="40"/>
-      </w:pPr>
-      <w:r>
-        <w:rPr>
-          <w:b/>
-          <w:bCs/>
-        </w:rPr>
-        <w:t xml:space="preserve">A red banner says “Microsoft has blocked macros because the source of this file is untrusted.”</w:t>
-      </w:r>
-    </w:p>
-    <w:p>
-      <w:pPr>
-        <w:spacing w:after="200"/>
-      </w:pPr>
-      <w:r>
-        <w:t xml:space="preserve">Same cause, same fix: Unblock the file (or the ZIP) and reopen. If Properties shows no Unblock box or the banner keeps coming back, your organization’s IT policy is blocking internet-sourced macros — add the extracted folder under File → Options → Trust Center → Trusted Locations, or ask IT to whitelist the folder.</w:t>
-      </w:r>
-    </w:p>
-    <w:p>
-      <w:pPr>
-        <w:spacing w:after="40"/>
-      </w:pPr>
-      <w:r>
-        <w:rPr>
-          <w:b/>
-          <w:bCs/>
-        </w:rPr>
-        <w:t xml:space="preserve">Running the macro stops with “Compile error: Sub or Function not defined.”</w:t>
-      </w:r>
-    </w:p>
-    <w:p>
-      <w:pPr>
-        <w:spacing w:after="200"/>
-      </w:pPr>
-      <w:r>
-        <w:t xml:space="preserve">Your analyzer workbook is from an older download. Download the latest ZIP from the vba branch and use the vba/TR-Analyzer.xlsm inside it.</w:t>
-      </w:r>
-    </w:p>
-    <w:p>
-      <w:pPr>
-        <w:spacing w:after="40"/>
-      </w:pPr>
-      <w:r>
-        <w:rPr>
-          <w:b/>
-          <w:bCs/>
-        </w:rPr>
-        <w:t xml:space="preserve">The macro says the file “doesn’t look like a Deal Level Input workbook.”</w:t>
-      </w:r>
-    </w:p>
-    <w:p>
-      <w:pPr>
-        <w:spacing w:after="200"/>
-      </w:pPr>
-      <w:r>
-        <w:t xml:space="preserve">You picked the GP’s raw track record file. Pick the “[date - GP] - Gross Deal Level Input.xlsx” you downloaded from the app instead.</w:t>
-      </w:r>
-    </w:p>
-    <w:p>
-      <w:pPr>
-        <w:spacing w:after="40"/>
-      </w:pPr>
-      <w:r>
-        <w:rPr>
-          <w:b/>
-          <w:bCs/>
-        </w:rPr>
-        <w:t xml:space="preserve">The macro says the input file “was generated by an OLDER version of the app.”</w:t>
-      </w:r>
-    </w:p>
-    <w:p>
-      <w:pPr>
-        <w:spacing w:after="200"/>
-      </w:pPr>
-      <w:r>
-        <w:t xml:space="preserve">The program and the input file must come from the same version. Re-download the latest program, run the GP’s file through the app again, and pick the freshly downloaded input file — an old input file cannot be imported safely because columns would land in the wrong places.</w:t>
-      </w:r>
-    </w:p>
-    <w:p>
-      <w:pPr>
-        <w:spacing w:after="40"/>
-      </w:pPr>
-      <w:r>
-        <w:rPr>
-          <w:b/>
-          <w:bCs/>
-        </w:rPr>
-        <w:t xml:space="preserve">TR-Analyzer.xlsm opens already full of a previous GP’s tabs.</w:t>
-      </w:r>
-    </w:p>
-    <w:p>
-      <w:pPr>
-        <w:spacing w:after="200"/>
-      </w:pPr>
-      <w:r>
-        <w:t xml:space="preserve">A finished analysis was saved over the analyzer at some point. Don’t keep using that copy: delete it and take a fresh vba/TR-Analyzer.xlsm from the program folder or ZIP. Always save a build under its own name (e.g. “GP_2 - Analysis.xlsm”) so the analyzer stays empty.</w:t>
-      </w:r>
-    </w:p>
-    <w:p>
-      <w:pPr>
-        <w:spacing w:after="40"/>
-      </w:pPr>
-      <w:r>
-        <w:rPr>
-          <w:b/>
-          <w:bCs/>
-        </w:rPr>
-        <w:t xml:space="preserve">A pivot’s total doesn’t match the number of deals.</w:t>
-      </w:r>
-    </w:p>
-    <w:p>
-      <w:pPr>
-        <w:spacing w:after="200"/>
-      </w:pPr>
-      <w:r>
-        <w:t xml:space="preserve">Deals missing that pivot’s label (say, no sector) are hidden from it and from its totals — nothing is deleted, and the Deal List always shows every deal. Un-hide them via the pivot’s filter dropdown if you want them counted.</w:t>
-      </w:r>
-    </w:p>
     <w:p>
       <w:pPr>
         <w:spacing w:after="120"/>

</xml_diff>

<commit_message>
Database renamed to "GP Track Record Database" (Eric)
The workbook publishes as "GP Track Record Database.xlsx" and the
sidebar mode reads "Publish to GP Track Record Database"; page title,
in-app copy, User Guide, Power BI notes, WORKFLOW and the User Manual
follow. A copy still carrying the old "TR Deal Database.xlsx" name is
renamed in place the next time anyone publishes, so every user
converges on the same file (verified: old-named database migrates and
the publish merges instead of starting a second file).

Co-Authored-By: Claude Fable 5 <noreply@anthropic.com>
</commit_message>
<xml_diff>
--- a/TR-Analyzer User Manual.docx
+++ b/TR-Analyzer User Manual.docx
@@ -1683,7 +1683,7 @@
           <w:b/>
           <w:bCs/>
         </w:rPr>
-        <w:t>Publish to database</w:t>
+        <w:t>Publish to GP Track Record Database</w:t>
       </w:r>
       <w:r>
         <w:t xml:space="preserve"> and upload that file.</w:t>
@@ -1758,7 +1758,7 @@
         <w:spacing w:after="120"/>
       </w:pPr>
       <w:r>
-        <w:t xml:space="preserve">On Publish, your GP’s rows merge into the one consolidated database workbook (TR Deal Database.xlsx, the team’s uploader format). Re-publishing the same GP and date </w:t>
+        <w:t xml:space="preserve">On Publish, your GP’s rows merge into the one consolidated database workbook (GP Track Record Database.xlsx, the team’s uploader format). Re-publishing the same GP and date </w:t>
       </w:r>
       <w:r>
         <w:rPr>
@@ -2524,7 +2524,7 @@
                 <w:sz w:val="22"/>
                 <w:szCs w:val="22"/>
               </w:rPr>
-              <w:t xml:space="preserve">(After verifying) sidebar → Publish to database → upload the verified file → Publish.</w:t>
+              <w:t xml:space="preserve">(After verifying) sidebar → Publish to GP Track Record Database → upload the verified file → Publish.</w:t>
             </w:r>
           </w:p>
         </w:tc>

</xml_diff>